<commit_message>
Update hardening plan doc: all FRD-12/10/14/11/16 items now fixed
</commit_message>
<xml_diff>
--- a/docs/GAP_ANALYSIS/Multi-Web_Hardening_Plan_FRD-12_10_14_11_16.docx
+++ b/docs/GAP_ANALYSIS/Multi-Web_Hardening_Plan_FRD-12_10_14_11_16.docx
@@ -46,7 +46,7 @@
         <w:spacing w:after="120"/>
       </w:pPr>
       <w:r>
-        <w:t xml:space="preserve">Following the FRD-06/13/15 hardening pass, this covers the next 5 highest-priority areas per the re-audit plan: Notification &amp; Communication Engine (FRD-12), Workflow &amp; Approval Engine (FRD-10), Reporting/BI Engine (FRD-14), Document &amp; Template Engine (FRD-11), and Shared Masters &amp; Configuration Engine (FRD-16). 20 items were investigated (read-only, evidence-based) across the 5 areas; 12 were real findings requiring action, 8 were checked and confirmed clean. Of the 12 real findings, 9 are fixed and committed (including one — the BoardResultUpload version race condition — found and fixed directly since it wasn't in the batch discovered already in progress). The remaining 3 open items are all Low/Medium severity, cosmetic or architectural notes rather than active bugs, and are called out explicitly below as acceptable to leave.</w:t>
+        <w:t xml:space="preserve">Following the FRD-06/13/15 hardening pass, this covers the next 5 highest-priority areas per the re-audit plan: Notification &amp; Communication Engine (FRD-12), Workflow &amp; Approval Engine (FRD-10), Reporting/BI Engine (FRD-14), Document &amp; Template Engine (FRD-11), and Shared Masters &amp; Configuration Engine (FRD-16). 20 items were investigated (read-only, evidence-based) across the 5 areas; 12 were real findings requiring action, 8 were checked and confirmed clean. All 12 real findings are now fixed and committed — 9 in the first pass (including one, the BoardResultUpload version race condition, found and fixed directly since it wasn't in the batch discovered already in progress), and the remaining 5 (all Low/Medium severity, cosmetic or architectural) closed in a follow-up pass. See "Follow-up Pass" below for what changed.</w:t>
       </w:r>
     </w:p>
     <w:tbl>
@@ -189,7 +189,7 @@
                 <w:b w:val="false"/>
                 <w:bCs w:val="false"/>
               </w:rPr>
-              <w:t xml:space="preserve">2 of 3</w:t>
+              <w:t xml:space="preserve">3 of 3</w:t>
             </w:r>
           </w:p>
         </w:tc>
@@ -207,7 +207,7 @@
                 <w:b w:val="false"/>
                 <w:bCs w:val="false"/>
               </w:rPr>
-              <w:t xml:space="preserve">Done except 1 minor</w:t>
+              <w:t xml:space="preserve">Done</w:t>
             </w:r>
           </w:p>
         </w:tc>
@@ -260,7 +260,7 @@
                 <w:b w:val="false"/>
                 <w:bCs w:val="false"/>
               </w:rPr>
-              <w:t xml:space="preserve">2 of 3</w:t>
+              <w:t xml:space="preserve">3 of 3</w:t>
             </w:r>
           </w:p>
         </w:tc>
@@ -278,7 +278,7 @@
                 <w:b w:val="false"/>
                 <w:bCs w:val="false"/>
               </w:rPr>
-              <w:t xml:space="preserve">Done except 1 cosmetic</w:t>
+              <w:t xml:space="preserve">Done</w:t>
             </w:r>
           </w:p>
         </w:tc>
@@ -331,7 +331,7 @@
                 <w:b w:val="false"/>
                 <w:bCs w:val="false"/>
               </w:rPr>
-              <w:t xml:space="preserve">1 of 2</w:t>
+              <w:t xml:space="preserve">2 of 2</w:t>
             </w:r>
           </w:p>
         </w:tc>
@@ -349,7 +349,7 @@
                 <w:b w:val="false"/>
                 <w:bCs w:val="false"/>
               </w:rPr>
-              <w:t xml:space="preserve">Done except 1 design note</w:t>
+              <w:t xml:space="preserve">Done</w:t>
             </w:r>
           </w:p>
         </w:tc>
@@ -402,7 +402,7 @@
                 <w:b w:val="false"/>
                 <w:bCs w:val="false"/>
               </w:rPr>
-              <w:t xml:space="preserve">2 of 3</w:t>
+              <w:t xml:space="preserve">3 of 3</w:t>
             </w:r>
           </w:p>
         </w:tc>
@@ -420,7 +420,7 @@
                 <w:b w:val="false"/>
                 <w:bCs w:val="false"/>
               </w:rPr>
-              <w:t xml:space="preserve">Done except 1 cosmetic</w:t>
+              <w:t xml:space="preserve">Done</w:t>
             </w:r>
           </w:p>
         </w:tc>
@@ -473,7 +473,7 @@
                 <w:b w:val="false"/>
                 <w:bCs w:val="false"/>
               </w:rPr>
-              <w:t xml:space="preserve">3 of 4</w:t>
+              <w:t xml:space="preserve">4 of 4</w:t>
             </w:r>
           </w:p>
         </w:tc>
@@ -491,7 +491,7 @@
                 <w:b w:val="false"/>
                 <w:bCs w:val="false"/>
               </w:rPr>
-              <w:t xml:space="preserve">Done except 1 perf note</w:t>
+              <w:t xml:space="preserve">Done</w:t>
             </w:r>
           </w:p>
         </w:tc>
@@ -524,7 +524,7 @@
           <w:iCs/>
           <w:color w:val="15803d"/>
         </w:rPr>
-        <w:t xml:space="preserve">Verdict: mostly clean; the one real delivery gap (MCQ batch fee notifications) is fixed.</w:t>
+        <w:t xml:space="preserve">Verdict: all 3 findings fixed, including the reminder-dedup guard closed in the follow-up pass.</w:t>
       </w:r>
     </w:p>
     <w:p>
@@ -820,25 +820,25 @@
                 <w:b w:val="false"/>
                 <w:bCs w:val="false"/>
               </w:rPr>
-              <w:t xml:space="preserve">No idempotency guard on scheduled reminder commands (SendTrainingReminders, SendBoardResultUploadReminders, SendMcqExamReminders) — a re-run same day could send duplicates.</w:t>
+              <w:t xml:space="preserve">No idempotency guard on scheduled reminder commands (SendTrainingReminders, SendBoardResultUploadReminders, SendMcqExamReminders) — a re-run same day could send duplicates. Fixed: new ReminderDedupGuard claims a per-day cache slot per (command, slug, entity, recipient) before each send.</w:t>
             </w:r>
           </w:p>
         </w:tc>
         <w:tc>
           <w:tcPr>
             <w:tcW w:type="dxa" w:w="2000"/>
-            <w:shd w:fill="FEF3C7" w:val="clear"/>
-          </w:tcPr>
-          <w:p>
-            <w:pPr>
-              <w:jc w:val="left"/>
-            </w:pPr>
-            <w:r>
-              <w:rPr>
-                <w:b w:val="false"/>
-                <w:bCs w:val="false"/>
-              </w:rPr>
-              <w:t xml:space="preserve">Open — minor, low blast radius</w:t>
+            <w:shd w:fill="DCFCE7" w:val="clear"/>
+          </w:tcPr>
+          <w:p>
+            <w:pPr>
+              <w:jc w:val="left"/>
+            </w:pPr>
+            <w:r>
+              <w:rPr>
+                <w:b w:val="false"/>
+                <w:bCs w:val="false"/>
+              </w:rPr>
+              <w:t xml:space="preserve">Fixed &amp; committed</w:t>
             </w:r>
           </w:p>
         </w:tc>
@@ -871,7 +871,7 @@
           <w:iCs/>
           <w:color w:val="15803d"/>
         </w:rPr>
-        <w:t xml:space="preserve">Verdict: the one High finding (missing permission gate) and the transaction-wrap Medium are fixed.</w:t>
+        <w:t xml:space="preserve">Verdict: all 3 real findings fixed, including the McqSchoolFee rejection-history consistency item closed in the follow-up pass.</w:t>
       </w:r>
     </w:p>
     <w:p>
@@ -1095,25 +1095,25 @@
                 <w:b w:val="false"/>
                 <w:bCs w:val="false"/>
               </w:rPr>
-              <w:t xml:space="preserve">Reopen/correction loop stylistic inconsistency: McqSchoolFee keeps a single rejection_reason with no history array (BoardResult appends to correction_history). Structurally safe since resubmission creates a new FeeReceipt row.</w:t>
+              <w:t xml:space="preserve">Reopen/correction loop stylistic inconsistency: McqSchoolFee keeps a single rejection_reason with no history array (BoardResult appends to correction_history). Structurally safe since resubmission creates a new FeeReceipt row. Fixed: FeeReceipt gains a rejection_history JSON column; McqSchoolFeeService::reject() now appends to it via FeeReceipt::appendRejectionHistory().</w:t>
             </w:r>
           </w:p>
         </w:tc>
         <w:tc>
           <w:tcPr>
             <w:tcW w:type="dxa" w:w="2000"/>
-            <w:shd w:fill="FEF3C7" w:val="clear"/>
-          </w:tcPr>
-          <w:p>
-            <w:pPr>
-              <w:jc w:val="left"/>
-            </w:pPr>
-            <w:r>
-              <w:rPr>
-                <w:b w:val="false"/>
-                <w:bCs w:val="false"/>
-              </w:rPr>
-              <w:t xml:space="preserve">Open — cosmetic/consistency only, no functional risk</w:t>
+            <w:shd w:fill="DCFCE7" w:val="clear"/>
+          </w:tcPr>
+          <w:p>
+            <w:pPr>
+              <w:jc w:val="left"/>
+            </w:pPr>
+            <w:r>
+              <w:rPr>
+                <w:b w:val="false"/>
+                <w:bCs w:val="false"/>
+              </w:rPr>
+              <w:t xml:space="preserve">Fixed &amp; committed</w:t>
             </w:r>
           </w:p>
         </w:tc>
@@ -1361,7 +1361,7 @@
           <w:iCs/>
           <w:color w:val="15803d"/>
         </w:rPr>
-        <w:t xml:space="preserve">Verdict: the one High finding (N+1 performance) is fixed.</w:t>
+        <w:t xml:space="preserve">Verdict: both real findings fixed, including RPT-FIN-021's stricter permission tier closed in the follow-up pass.</w:t>
       </w:r>
     </w:p>
     <w:p>
@@ -1584,25 +1584,25 @@
                 <w:b w:val="false"/>
                 <w:bCs w:val="false"/>
               </w:rPr>
-              <w:t xml:space="preserve">RPT-FIN-021 (fee-ledger reconciliation) gets the same access tier as routine collection reports, with no sensitivity-based permission tiering. Pre-existing coarse model, not a regression introduced by the new reports.</w:t>
+              <w:t xml:space="preserve">RPT-FIN-021 (fee-ledger reconciliation) gets the same access tier as routine collection reports, with no sensitivity-based permission tiering. Pre-existing coarse model, not a regression introduced by the new reports. Fixed: ReportRunner::authorize() now requires sahodaya_admin specifically for RPT-FIN-021, stricter than the shared sahodaya_admin/sahodaya_finance tier used for other RPT-FIN-*/RPT-PAY-* reports.</w:t>
             </w:r>
           </w:p>
         </w:tc>
         <w:tc>
           <w:tcPr>
             <w:tcW w:type="dxa" w:w="2000"/>
-            <w:shd w:fill="FEF3C7" w:val="clear"/>
-          </w:tcPr>
-          <w:p>
-            <w:pPr>
-              <w:jc w:val="left"/>
-            </w:pPr>
-            <w:r>
-              <w:rPr>
-                <w:b w:val="false"/>
-                <w:bCs w:val="false"/>
-              </w:rPr>
-              <w:t xml:space="preserve">Open — design-level, acceptable to leave for now</w:t>
+            <w:shd w:fill="DCFCE7" w:val="clear"/>
+          </w:tcPr>
+          <w:p>
+            <w:pPr>
+              <w:jc w:val="left"/>
+            </w:pPr>
+            <w:r>
+              <w:rPr>
+                <w:b w:val="false"/>
+                <w:bCs w:val="false"/>
+              </w:rPr>
+              <w:t xml:space="preserve">Fixed &amp; committed</w:t>
             </w:r>
           </w:p>
         </w:tc>
@@ -1849,7 +1849,7 @@
           <w:iCs/>
           <w:color w:val="15803d"/>
         </w:rPr>
-        <w:t xml:space="preserve">Verdict: the one High finding (version race condition) and the Medium (version download) are fixed.</w:t>
+        <w:t xml:space="preserve">Verdict: all 3 real findings fixed, including the ID-card CSS de-duplication closed in the follow-up pass.</w:t>
       </w:r>
     </w:p>
     <w:p>
@@ -2358,25 +2358,25 @@
                 <w:b w:val="false"/>
                 <w:bCs w:val="false"/>
               </w:rPr>
-              <w:t xml:space="preserve">Training ID card and Fest ID card templates both use standalone inline &lt;style&gt; blocks rather than a shared layout — CSS duplication, not a functional defect (training card correctly modeled itself on the existing Fest pattern).</w:t>
+              <w:t xml:space="preserve">Training ID card and Fest ID card templates both use standalone inline &lt;style&gt; blocks rather than a shared layout — CSS duplication, not a functional defect (training card correctly modeled itself on the existing Fest pattern). Fixed: byte-identical rules extracted into a shared partials/id-card-base-styles partial included by both; only rules that were 100% identical were moved, so rendered output is unchanged.</w:t>
             </w:r>
           </w:p>
         </w:tc>
         <w:tc>
           <w:tcPr>
             <w:tcW w:type="dxa" w:w="2000"/>
-            <w:shd w:fill="FEF3C7" w:val="clear"/>
-          </w:tcPr>
-          <w:p>
-            <w:pPr>
-              <w:jc w:val="left"/>
-            </w:pPr>
-            <w:r>
-              <w:rPr>
-                <w:b w:val="false"/>
-                <w:bCs w:val="false"/>
-              </w:rPr>
-              <w:t xml:space="preserve">Open — cosmetic cleanup opportunity only</w:t>
+            <w:shd w:fill="DCFCE7" w:val="clear"/>
+          </w:tcPr>
+          <w:p>
+            <w:pPr>
+              <w:jc w:val="left"/>
+            </w:pPr>
+            <w:r>
+              <w:rPr>
+                <w:b w:val="false"/>
+                <w:bCs w:val="false"/>
+              </w:rPr>
+              <w:t xml:space="preserve">Fixed &amp; committed</w:t>
             </w:r>
           </w:p>
         </w:tc>
@@ -2409,7 +2409,7 @@
           <w:iCs/>
           <w:color w:val="15803d"/>
         </w:rPr>
-        <w:t xml:space="preserve">Verdict: the one Critical finding and its two related High/Medium findings are fixed.</w:t>
+        <w:t xml:space="preserve">Verdict: all 4 findings fixed, including caching on master lookups closed in the follow-up pass.</w:t>
       </w:r>
     </w:p>
     <w:p>
@@ -2777,25 +2777,25 @@
                 <w:b w:val="false"/>
                 <w:bCs w:val="false"/>
               </w:rPr>
-              <w:t xml:space="preserve">No caching layer exists on ExamStream::labelsFor()/findByCode() or the other new masters — not a staleness bug today since there's nothing to invalidate, but a missed performance opportunity on these hot-path lookups.</w:t>
+              <w:t xml:space="preserve">No caching layer exists on ExamStream::labelsFor()/findByCode() or the other new masters — not a staleness bug today since there's nothing to invalidate, but a missed performance opportunity on these hot-path lookups. Fixed: both methods cache via Cache::remember() (6h TTL, tenant/db-scoped keys), with ExamStream::forgetCache() invalidation wired into BoardResultMastersController's create/update/destroy actions.</w:t>
             </w:r>
           </w:p>
         </w:tc>
         <w:tc>
           <w:tcPr>
             <w:tcW w:type="dxa" w:w="2000"/>
-            <w:shd w:fill="FEF3C7" w:val="clear"/>
-          </w:tcPr>
-          <w:p>
-            <w:pPr>
-              <w:jc w:val="left"/>
-            </w:pPr>
-            <w:r>
-              <w:rPr>
-                <w:b w:val="false"/>
-                <w:bCs w:val="false"/>
-              </w:rPr>
-              <w:t xml:space="preserve">Open — performance polish only, not a correctness issue</w:t>
+            <w:shd w:fill="DCFCE7" w:val="clear"/>
+          </w:tcPr>
+          <w:p>
+            <w:pPr>
+              <w:jc w:val="left"/>
+            </w:pPr>
+            <w:r>
+              <w:rPr>
+                <w:b w:val="false"/>
+                <w:bCs w:val="false"/>
+              </w:rPr>
+              <w:t xml:space="preserve">Fixed &amp; committed</w:t>
             </w:r>
           </w:p>
         </w:tc>
@@ -2815,7 +2815,7 @@
         <w:spacing w:after="150" w:before="300"/>
       </w:pPr>
       <w:r>
-        <w:t xml:space="preserve">Remaining Open Items</w:t>
+        <w:t xml:space="preserve">Follow-up Pass — Remaining 5 Items Closed</w:t>
       </w:r>
     </w:p>
     <w:p>
@@ -2823,7 +2823,7 @@
         <w:spacing w:after="120"/>
       </w:pPr>
       <w:r>
-        <w:t xml:space="preserve">3 items are intentionally left open — all are Low/Medium severity, cosmetic, or architectural notes rather than active bugs:</w:t>
+        <w:t xml:space="preserve">The 5 items originally left open (all Low/Medium severity, cosmetic or architectural) were closed in a follow-up pass:</w:t>
       </w:r>
     </w:p>
     <w:p>
@@ -2836,7 +2836,7 @@
         <w:spacing w:after="60"/>
       </w:pPr>
       <w:r>
-        <w:t xml:space="preserve">FRD-12 — no dedup guard on scheduled reminder commands (re-running the scheduler twice in a day could send duplicate reminders). Low risk, low effort if revisited.</w:t>
+        <w:t xml:space="preserve">FRD-12 — reminder dedup: new ReminderDedupGuard (app/Support/ReminderDedupGuard.php) claims a per-day cache slot keyed by command + reminder slug + entity id + recipient id before sending; wired into SendTrainingReminders, SendBoardResultUploadReminders, and SendMcqExamReminders.</w:t>
       </w:r>
     </w:p>
     <w:p>
@@ -2849,7 +2849,7 @@
         <w:spacing w:after="60"/>
       </w:pPr>
       <w:r>
-        <w:t xml:space="preserve">FRD-10 — McqSchoolFee's rejection history isn't append-only like BoardResult's (stylistic only; resubmission already creates a new FeeReceipt row so no data is lost).</w:t>
+        <w:t xml:space="preserve">FRD-10 — McqSchoolFee rejection history: FeeReceipt gained a rejection_history JSON column (migration 2026_08_09_000001) and an appendRejectionHistory() helper; McqSchoolFeeService::reject() now appends instead of only overwriting rejection_reason, matching BoardResult.correction_history.</w:t>
       </w:r>
     </w:p>
     <w:p>
@@ -2862,7 +2862,7 @@
         <w:spacing w:after="60"/>
       </w:pPr>
       <w:r>
-        <w:t xml:space="preserve">FRD-14 — RPT-FIN-021 has the same access tier as routine reports rather than a stricter one; would need a broader permission-tiering redesign across all reports to address properly, not specific to this report.</w:t>
+        <w:t xml:space="preserve">FRD-14 — RPT-FIN-021 permission tier: ReportRunner::authorize() now requires sahodaya_admin specifically for RPT-FIN-021 (fee-ledger reconciliation), stricter than the sahodaya_admin/sahodaya_finance tier shared by other RPT-FIN-*/RPT-PAY-* reports.</w:t>
       </w:r>
     </w:p>
     <w:p>
@@ -2875,7 +2875,7 @@
         <w:spacing w:after="60"/>
       </w:pPr>
       <w:r>
-        <w:t xml:space="preserve">FRD-11 — Training ID card and Fest ID card templates duplicate CSS instead of sharing a layout partial; cosmetic cleanup only.</w:t>
+        <w:t xml:space="preserve">FRD-11 — ID card CSS: extracted the rules that were byte-identical between the Training ID card and Fest ID card templates into a shared partials/id-card-base-styles.blade.php, included by both. Only fully-identical rules were moved (box reset, body typography, .card__role, .card__id-label, .card__initials/.card__avatar-inner) — no rendering changes.</w:t>
       </w:r>
     </w:p>
     <w:p>
@@ -2888,7 +2888,7 @@
         <w:spacing w:after="60"/>
       </w:pPr>
       <w:r>
-        <w:t xml:space="preserve">FRD-16 — no caching on master lookups; a performance opportunity, not a correctness bug since there's nothing to go stale.</w:t>
+        <w:t xml:space="preserve">FRD-16 — master-lookup caching: ExamStream::labelsFor()/findByCode() now cache via Cache::remember() (6h TTL) with keys scoped by sahodaya_id, falling back to the current tenant DB name for global-only lookups so cache entries can't leak across tenants. ExamStream::forgetCache() invalidation is wired into BoardResultMastersController's storeStream/updateStream/destroyStream actions.</w:t>
       </w:r>
     </w:p>
     <w:sectPr>

</xml_diff>